<commit_message>
Switch VLANs setup 10,20, and 30 | Mgmt port is 48 & on 10 | Trunk port is 3 no VLAN yet
</commit_message>
<xml_diff>
--- a/SOC-Lab-Cheatsheet.docx
+++ b/SOC-Lab-Cheatsheet.docx
@@ -1785,7 +1785,7 @@
           <w:sz w:val="21"/>
           <w:szCs w:val="21"/>
         </w:rPr>
-        <w:t xml:space="preserve">Session → Logging → "All session output" → log file: C:\Users\micha\lab\logs\switch-&amp;Y&amp;M&amp;D-&amp;T.log</w:t>
+        <w:t xml:space="preserve">Session → Logging → "All session output" → log file: C:\Users\micha\SOC-Lab\Updated 7-16-2026\logs\switch-&amp;Y&amp;M&amp;D-&amp;T.log</w:t>
       </w:r>
     </w:p>
     <w:p>
@@ -1846,7 +1846,7 @@
           <w:sz w:val="17"/>
           <w:szCs w:val="17"/>
         </w:rPr>
-        <w:t xml:space="preserve">Start-Transcript -Path "C:\Users\micha\lab\logs\session-$(Get-Date -Format 'yyyy-MM-dd-HHmm').txt"</w:t>
+        <w:t xml:space="preserve">Start-Transcript -Path "C:\Users\micha\SOC-Lab\Updated 7-16-2026\logs\session-$(Get-Date -Format 'yyyy-MM-dd-HHmm').txt"</w:t>
       </w:r>
     </w:p>
     <w:p>
@@ -2132,6 +2132,22 @@
           <w:sz w:val="17"/>
           <w:szCs w:val="17"/>
         </w:rPr>
+        <w:t xml:space="preserve">ip route show                # confirm a default gateway exists — its absence can look like a DNS/repo failure</w:t>
+      </w:r>
+    </w:p>
+    <w:p>
+      <w:pPr>
+        <w:shd w:fill="F4F6F8" w:val="clear"/>
+        <w:spacing w:after="0" w:before="0" w:line="250"/>
+        <w:ind w:left="140" w:right="140"/>
+      </w:pPr>
+      <w:r>
+        <w:rPr>
+          <w:rFonts w:ascii="Consolas" w:cs="Consolas" w:eastAsia="Consolas" w:hAnsi="Consolas"/>
+          <w:color w:val="1F2328"/>
+          <w:sz w:val="17"/>
+          <w:szCs w:val="17"/>
+        </w:rPr>
         <w:t xml:space="preserve">ip addr flush dev vmbr0      # nuke an IP off a bridge immediately</w:t>
       </w:r>
     </w:p>
@@ -2208,7 +2224,7 @@
           <w:sz w:val="21"/>
           <w:szCs w:val="21"/>
         </w:rPr>
-        <w:t xml:space="preserve">The two bridge gotchas you already hit:</w:t>
+        <w:t xml:space="preserve">The three bridge/network gotchas you already hit:</w:t>
       </w:r>
     </w:p>
     <w:p>
@@ -2243,6 +2259,23 @@
           <w:szCs w:val="21"/>
         </w:rPr>
         <w:t xml:space="preserve">Moving a cable/bridge orphans any VM still pointed at the old one. Check every VM's Hardware tab after.</w:t>
+      </w:r>
+    </w:p>
+    <w:p>
+      <w:pPr>
+        <w:pStyle w:val="ListParagraph"/>
+        <w:numPr>
+          <w:ilvl w:val="0"/>
+          <w:numId w:val="2"/>
+        </w:numPr>
+        <w:spacing w:after="50" w:before="50"/>
+      </w:pPr>
+      <w:r>
+        <w:rPr>
+          <w:sz w:val="21"/>
+          <w:szCs w:val="21"/>
+        </w:rPr>
+        <w:t xml:space="preserve">A NIC showing no link may just be administratively down, not dead hardware — check ip link show / ip link set &lt;iface&gt; up before chasing cables, BIOS, or iDRAC logs.</w:t>
       </w:r>
     </w:p>
     <w:p>
@@ -3193,215 +3226,227 @@
           <w:sz w:val="17"/>
           <w:szCs w:val="17"/>
         </w:rPr>
-        <w:t xml:space="preserve">C:\Users\micha\lab\</w:t>
-      </w:r>
-    </w:p>
-    <w:p>
-      <w:pPr>
-        <w:shd w:fill="F4F6F8" w:val="clear"/>
-        <w:spacing w:after="0" w:before="0" w:line="250"/>
-        <w:ind w:left="140" w:right="140"/>
-      </w:pPr>
-      <w:r>
-        <w:rPr>
-          <w:rFonts w:ascii="Consolas" w:cs="Consolas" w:eastAsia="Consolas" w:hAnsi="Consolas"/>
-          <w:color w:val="1F2328"/>
-          <w:sz w:val="17"/>
-          <w:szCs w:val="17"/>
-        </w:rPr>
-        <w:t xml:space="preserve">├── ai-node\                        &lt;- separate project, don't merge</w:t>
-      </w:r>
-    </w:p>
-    <w:p>
-      <w:pPr>
-        <w:shd w:fill="F4F6F8" w:val="clear"/>
-        <w:spacing w:after="0" w:before="0" w:line="250"/>
-        <w:ind w:left="140" w:right="140"/>
-      </w:pPr>
-      <w:r>
-        <w:rPr>
-          <w:rFonts w:ascii="Consolas" w:cs="Consolas" w:eastAsia="Consolas" w:hAnsi="Consolas"/>
-          <w:color w:val="1F2328"/>
-          <w:sz w:val="17"/>
-          <w:szCs w:val="17"/>
-        </w:rPr>
-        <w:t xml:space="preserve">│   ├── hybrid_ai_node_build_plan.md</w:t>
-      </w:r>
-    </w:p>
-    <w:p>
-      <w:pPr>
-        <w:shd w:fill="F4F6F8" w:val="clear"/>
-        <w:spacing w:after="0" w:before="0" w:line="250"/>
-        <w:ind w:left="140" w:right="140"/>
-      </w:pPr>
-      <w:r>
-        <w:rPr>
-          <w:rFonts w:ascii="Consolas" w:cs="Consolas" w:eastAsia="Consolas" w:hAnsi="Consolas"/>
-          <w:color w:val="1F2328"/>
-          <w:sz w:val="17"/>
-          <w:szCs w:val="17"/>
-        </w:rPr>
-        <w:t xml:space="preserve">│   └── build_log.md</w:t>
-      </w:r>
-    </w:p>
-    <w:p>
-      <w:pPr>
-        <w:shd w:fill="F4F6F8" w:val="clear"/>
-        <w:spacing w:after="0" w:before="0" w:line="250"/>
-        <w:ind w:left="140" w:right="140"/>
-      </w:pPr>
-      <w:r>
-        <w:rPr>
-          <w:rFonts w:ascii="Consolas" w:cs="Consolas" w:eastAsia="Consolas" w:hAnsi="Consolas"/>
-          <w:color w:val="1F2328"/>
-          <w:sz w:val="17"/>
-          <w:szCs w:val="17"/>
-        </w:rPr>
-        <w:t xml:space="preserve">├── logs\                           &lt;- session transcripts land here</w:t>
-      </w:r>
-    </w:p>
-    <w:p>
-      <w:pPr>
-        <w:shd w:fill="F4F6F8" w:val="clear"/>
-        <w:spacing w:after="0" w:before="0" w:line="250"/>
-        <w:ind w:left="140" w:right="140"/>
-      </w:pPr>
-      <w:r>
-        <w:rPr>
-          <w:rFonts w:ascii="Consolas" w:cs="Consolas" w:eastAsia="Consolas" w:hAnsi="Consolas"/>
-          <w:color w:val="1F2328"/>
-          <w:sz w:val="17"/>
-          <w:szCs w:val="17"/>
-        </w:rPr>
-        <w:t xml:space="preserve">└── soc-lab\                        &lt;- your project folder</w:t>
-      </w:r>
-    </w:p>
-    <w:p>
-      <w:pPr>
-        <w:shd w:fill="F4F6F8" w:val="clear"/>
-        <w:spacing w:after="0" w:before="0" w:line="250"/>
-        <w:ind w:left="140" w:right="140"/>
-      </w:pPr>
-      <w:r>
-        <w:rPr>
-          <w:rFonts w:ascii="Consolas" w:cs="Consolas" w:eastAsia="Consolas" w:hAnsi="Consolas"/>
-          <w:color w:val="1F2328"/>
-          <w:sz w:val="17"/>
-          <w:szCs w:val="17"/>
-        </w:rPr>
-        <w:t xml:space="preserve">    ├── CLAUDE.md                   &lt;- paste into Project instructions</w:t>
-      </w:r>
-    </w:p>
-    <w:p>
-      <w:pPr>
-        <w:shd w:fill="F4F6F8" w:val="clear"/>
-        <w:spacing w:after="0" w:before="0" w:line="250"/>
-        <w:ind w:left="140" w:right="140"/>
-      </w:pPr>
-      <w:r>
-        <w:rPr>
-          <w:rFonts w:ascii="Consolas" w:cs="Consolas" w:eastAsia="Consolas" w:hAnsi="Consolas"/>
-          <w:color w:val="1F2328"/>
-          <w:sz w:val="17"/>
-          <w:szCs w:val="17"/>
-        </w:rPr>
-        <w:t xml:space="preserve">    ├── LAB-BLUEPRINT.md            &lt;- shared reference: what + what order</w:t>
-      </w:r>
-    </w:p>
-    <w:p>
-      <w:pPr>
-        <w:shd w:fill="F4F6F8" w:val="clear"/>
-        <w:spacing w:after="0" w:before="0" w:line="250"/>
-        <w:ind w:left="140" w:right="140"/>
-      </w:pPr>
-      <w:r>
-        <w:rPr>
-          <w:rFonts w:ascii="Consolas" w:cs="Consolas" w:eastAsia="Consolas" w:hAnsi="Consolas"/>
-          <w:color w:val="1F2328"/>
-          <w:sz w:val="17"/>
-          <w:szCs w:val="17"/>
-        </w:rPr>
-        <w:t xml:space="preserve">    ├── LESSON-PLAN-1-BUILDER.md    &lt;- you read this (engineer brain)</w:t>
-      </w:r>
-    </w:p>
-    <w:p>
-      <w:pPr>
-        <w:shd w:fill="F4F6F8" w:val="clear"/>
-        <w:spacing w:after="0" w:before="0" w:line="250"/>
-        <w:ind w:left="140" w:right="140"/>
-      </w:pPr>
-      <w:r>
-        <w:rPr>
-          <w:rFonts w:ascii="Consolas" w:cs="Consolas" w:eastAsia="Consolas" w:hAnsi="Consolas"/>
-          <w:color w:val="1F2328"/>
-          <w:sz w:val="17"/>
-          <w:szCs w:val="17"/>
-        </w:rPr>
-        <w:t xml:space="preserve">    ├── LESSON-PLAN-2-OPERATOR.md   &lt;- you read this (analyst brain)</w:t>
-      </w:r>
-    </w:p>
-    <w:p>
-      <w:pPr>
-        <w:shd w:fill="F4F6F8" w:val="clear"/>
-        <w:spacing w:after="0" w:before="0" w:line="250"/>
-        <w:ind w:left="140" w:right="140"/>
-      </w:pPr>
-      <w:r>
-        <w:rPr>
-          <w:rFonts w:ascii="Consolas" w:cs="Consolas" w:eastAsia="Consolas" w:hAnsi="Consolas"/>
-          <w:color w:val="1F2328"/>
-          <w:sz w:val="17"/>
-          <w:szCs w:val="17"/>
-        </w:rPr>
-        <w:t xml:space="preserve">    ├── CHEATSHEET.md               &lt;- this file</w:t>
-      </w:r>
-    </w:p>
-    <w:p>
-      <w:pPr>
-        <w:shd w:fill="F4F6F8" w:val="clear"/>
-        <w:spacing w:after="0" w:before="0" w:line="250"/>
-        <w:ind w:left="140" w:right="140"/>
-      </w:pPr>
-      <w:r>
-        <w:rPr>
-          <w:rFonts w:ascii="Consolas" w:cs="Consolas" w:eastAsia="Consolas" w:hAnsi="Consolas"/>
-          <w:color w:val="1F2328"/>
-          <w:sz w:val="17"/>
-          <w:szCs w:val="17"/>
-        </w:rPr>
-        <w:t xml:space="preserve">    ├── build_log.md                &lt;- created Phase A, maintained throughout</w:t>
-      </w:r>
-    </w:p>
-    <w:p>
-      <w:pPr>
-        <w:shd w:fill="F4F6F8" w:val="clear"/>
-        <w:spacing w:after="0" w:before="0" w:line="250"/>
-        <w:ind w:left="140" w:right="140"/>
-      </w:pPr>
-      <w:r>
-        <w:rPr>
-          <w:rFonts w:ascii="Consolas" w:cs="Consolas" w:eastAsia="Consolas" w:hAnsi="Consolas"/>
-          <w:color w:val="1F2328"/>
-          <w:sz w:val="17"/>
-          <w:szCs w:val="17"/>
-        </w:rPr>
-        <w:t xml:space="preserve">    ├── agent-registry.md           &lt;- created Phase D</w:t>
-      </w:r>
-    </w:p>
-    <w:p>
-      <w:pPr>
-        <w:shd w:fill="F4F6F8" w:val="clear"/>
-        <w:spacing w:after="0" w:before="0" w:line="250"/>
-        <w:ind w:left="140" w:right="140"/>
-      </w:pPr>
-      <w:r>
-        <w:rPr>
-          <w:rFonts w:ascii="Consolas" w:cs="Consolas" w:eastAsia="Consolas" w:hAnsi="Consolas"/>
-          <w:color w:val="1F2328"/>
-          <w:sz w:val="17"/>
-          <w:szCs w:val="17"/>
-        </w:rPr>
-        <w:t xml:space="preserve">    └── investigations\             &lt;- your writeups = the portfolio</w:t>
+        <w:t xml:space="preserve">C:\Users\micha\lab\ai-node\               &lt;- separate project, don't merge</w:t>
+      </w:r>
+    </w:p>
+    <w:p>
+      <w:pPr>
+        <w:shd w:fill="F4F6F8" w:val="clear"/>
+        <w:spacing w:after="0" w:before="0" w:line="250"/>
+        <w:ind w:left="140" w:right="140"/>
+      </w:pPr>
+      <w:r>
+        <w:rPr>
+          <w:rFonts w:ascii="Consolas" w:cs="Consolas" w:eastAsia="Consolas" w:hAnsi="Consolas"/>
+          <w:color w:val="1F2328"/>
+          <w:sz w:val="17"/>
+          <w:szCs w:val="17"/>
+        </w:rPr>
+        <w:t xml:space="preserve">├── hybrid_ai_node_build_plan.md</w:t>
+      </w:r>
+    </w:p>
+    <w:p>
+      <w:pPr>
+        <w:shd w:fill="F4F6F8" w:val="clear"/>
+        <w:spacing w:after="0" w:before="0" w:line="250"/>
+        <w:ind w:left="140" w:right="140"/>
+      </w:pPr>
+      <w:r>
+        <w:rPr>
+          <w:rFonts w:ascii="Consolas" w:cs="Consolas" w:eastAsia="Consolas" w:hAnsi="Consolas"/>
+          <w:color w:val="1F2328"/>
+          <w:sz w:val="17"/>
+          <w:szCs w:val="17"/>
+        </w:rPr>
+        <w:t xml:space="preserve">└── build_log.md</w:t>
+      </w:r>
+    </w:p>
+    <w:p>
+      <w:pPr>
+        <w:shd w:fill="F4F6F8" w:val="clear"/>
+        <w:spacing w:after="0" w:before="0"/>
+      </w:pPr>
+      <w:r>
+        <w:rPr>
+          <w:rFonts w:ascii="Consolas" w:cs="Consolas" w:eastAsia="Consolas" w:hAnsi="Consolas"/>
+          <w:sz w:val="10"/>
+          <w:szCs w:val="10"/>
+        </w:rPr>
+        <w:t xml:space="preserve"/>
+      </w:r>
+    </w:p>
+    <w:p>
+      <w:pPr>
+        <w:shd w:fill="F4F6F8" w:val="clear"/>
+        <w:spacing w:after="0" w:before="0" w:line="250"/>
+        <w:ind w:left="140" w:right="140"/>
+      </w:pPr>
+      <w:r>
+        <w:rPr>
+          <w:rFonts w:ascii="Consolas" w:cs="Consolas" w:eastAsia="Consolas" w:hAnsi="Consolas"/>
+          <w:color w:val="1F2328"/>
+          <w:sz w:val="17"/>
+          <w:szCs w:val="17"/>
+        </w:rPr>
+        <w:t xml:space="preserve">C:\Users\micha\SOC-Lab\Updated 7-16-2026\  &lt;- your project folder (git repo root)</w:t>
+      </w:r>
+    </w:p>
+    <w:p>
+      <w:pPr>
+        <w:shd w:fill="F4F6F8" w:val="clear"/>
+        <w:spacing w:after="0" w:before="0" w:line="250"/>
+        <w:ind w:left="140" w:right="140"/>
+      </w:pPr>
+      <w:r>
+        <w:rPr>
+          <w:rFonts w:ascii="Consolas" w:cs="Consolas" w:eastAsia="Consolas" w:hAnsi="Consolas"/>
+          <w:color w:val="1F2328"/>
+          <w:sz w:val="17"/>
+          <w:szCs w:val="17"/>
+        </w:rPr>
+        <w:t xml:space="preserve">├── CLAUDE.md                   &lt;- paste into Project instructions</w:t>
+      </w:r>
+    </w:p>
+    <w:p>
+      <w:pPr>
+        <w:shd w:fill="F4F6F8" w:val="clear"/>
+        <w:spacing w:after="0" w:before="0" w:line="250"/>
+        <w:ind w:left="140" w:right="140"/>
+      </w:pPr>
+      <w:r>
+        <w:rPr>
+          <w:rFonts w:ascii="Consolas" w:cs="Consolas" w:eastAsia="Consolas" w:hAnsi="Consolas"/>
+          <w:color w:val="1F2328"/>
+          <w:sz w:val="17"/>
+          <w:szCs w:val="17"/>
+        </w:rPr>
+        <w:t xml:space="preserve">├── LAB-BLUEPRINT.md            &lt;- shared reference: what + what order</w:t>
+      </w:r>
+    </w:p>
+    <w:p>
+      <w:pPr>
+        <w:shd w:fill="F4F6F8" w:val="clear"/>
+        <w:spacing w:after="0" w:before="0" w:line="250"/>
+        <w:ind w:left="140" w:right="140"/>
+      </w:pPr>
+      <w:r>
+        <w:rPr>
+          <w:rFonts w:ascii="Consolas" w:cs="Consolas" w:eastAsia="Consolas" w:hAnsi="Consolas"/>
+          <w:color w:val="1F2328"/>
+          <w:sz w:val="17"/>
+          <w:szCs w:val="17"/>
+        </w:rPr>
+        <w:t xml:space="preserve">├── LESSON-PLAN-1-BUILDER.md    &lt;- you read this (engineer brain)</w:t>
+      </w:r>
+    </w:p>
+    <w:p>
+      <w:pPr>
+        <w:shd w:fill="F4F6F8" w:val="clear"/>
+        <w:spacing w:after="0" w:before="0" w:line="250"/>
+        <w:ind w:left="140" w:right="140"/>
+      </w:pPr>
+      <w:r>
+        <w:rPr>
+          <w:rFonts w:ascii="Consolas" w:cs="Consolas" w:eastAsia="Consolas" w:hAnsi="Consolas"/>
+          <w:color w:val="1F2328"/>
+          <w:sz w:val="17"/>
+          <w:szCs w:val="17"/>
+        </w:rPr>
+        <w:t xml:space="preserve">├── LESSON-PLAN-2-OPERATOR.md   &lt;- you read this (analyst brain)</w:t>
+      </w:r>
+    </w:p>
+    <w:p>
+      <w:pPr>
+        <w:shd w:fill="F4F6F8" w:val="clear"/>
+        <w:spacing w:after="0" w:before="0" w:line="250"/>
+        <w:ind w:left="140" w:right="140"/>
+      </w:pPr>
+      <w:r>
+        <w:rPr>
+          <w:rFonts w:ascii="Consolas" w:cs="Consolas" w:eastAsia="Consolas" w:hAnsi="Consolas"/>
+          <w:color w:val="1F2328"/>
+          <w:sz w:val="17"/>
+          <w:szCs w:val="17"/>
+        </w:rPr>
+        <w:t xml:space="preserve">├── CHEATSHEET.md               &lt;- this file</w:t>
+      </w:r>
+    </w:p>
+    <w:p>
+      <w:pPr>
+        <w:shd w:fill="F4F6F8" w:val="clear"/>
+        <w:spacing w:after="0" w:before="0" w:line="250"/>
+        <w:ind w:left="140" w:right="140"/>
+      </w:pPr>
+      <w:r>
+        <w:rPr>
+          <w:rFonts w:ascii="Consolas" w:cs="Consolas" w:eastAsia="Consolas" w:hAnsi="Consolas"/>
+          <w:color w:val="1F2328"/>
+          <w:sz w:val="17"/>
+          <w:szCs w:val="17"/>
+        </w:rPr>
+        <w:t xml:space="preserve">├── build_log.md                &lt;- created Phase A, maintained throughout</w:t>
+      </w:r>
+    </w:p>
+    <w:p>
+      <w:pPr>
+        <w:shd w:fill="F4F6F8" w:val="clear"/>
+        <w:spacing w:after="0" w:before="0" w:line="250"/>
+        <w:ind w:left="140" w:right="140"/>
+      </w:pPr>
+      <w:r>
+        <w:rPr>
+          <w:rFonts w:ascii="Consolas" w:cs="Consolas" w:eastAsia="Consolas" w:hAnsi="Consolas"/>
+          <w:color w:val="1F2328"/>
+          <w:sz w:val="17"/>
+          <w:szCs w:val="17"/>
+        </w:rPr>
+        <w:t xml:space="preserve">├── agent-registry.md           &lt;- created Phase D</w:t>
+      </w:r>
+    </w:p>
+    <w:p>
+      <w:pPr>
+        <w:shd w:fill="F4F6F8" w:val="clear"/>
+        <w:spacing w:after="0" w:before="0" w:line="250"/>
+        <w:ind w:left="140" w:right="140"/>
+      </w:pPr>
+      <w:r>
+        <w:rPr>
+          <w:rFonts w:ascii="Consolas" w:cs="Consolas" w:eastAsia="Consolas" w:hAnsi="Consolas"/>
+          <w:color w:val="1F2328"/>
+          <w:sz w:val="17"/>
+          <w:szCs w:val="17"/>
+        </w:rPr>
+        <w:t xml:space="preserve">└── investigations\             &lt;- your writeups = the portfolio</w:t>
+      </w:r>
+    </w:p>
+    <w:p>
+      <w:pPr>
+        <w:shd w:fill="F4F6F8" w:val="clear"/>
+        <w:spacing w:after="0" w:before="0"/>
+      </w:pPr>
+      <w:r>
+        <w:rPr>
+          <w:rFonts w:ascii="Consolas" w:cs="Consolas" w:eastAsia="Consolas" w:hAnsi="Consolas"/>
+          <w:sz w:val="10"/>
+          <w:szCs w:val="10"/>
+        </w:rPr>
+        <w:t xml:space="preserve"/>
+      </w:r>
+    </w:p>
+    <w:p>
+      <w:pPr>
+        <w:shd w:fill="F4F6F8" w:val="clear"/>
+        <w:spacing w:after="0" w:before="0" w:line="250"/>
+        <w:ind w:left="140" w:right="140"/>
+      </w:pPr>
+      <w:r>
+        <w:rPr>
+          <w:rFonts w:ascii="Consolas" w:cs="Consolas" w:eastAsia="Consolas" w:hAnsi="Consolas"/>
+          <w:color w:val="1F2328"/>
+          <w:sz w:val="17"/>
+          <w:szCs w:val="17"/>
+        </w:rPr>
+        <w:t xml:space="preserve">C:\Users\micha\SOC-Lab\Logs\              &lt;- session transcripts (sibling to repo root, outside Git)</w:t>
       </w:r>
     </w:p>
     <w:p>

</xml_diff>

<commit_message>
Restore cheatsheet source .md, update Logs references to Session Logging and Build Logs
</commit_message>
<xml_diff>
--- a/SOC-Lab-Cheatsheet.docx
+++ b/SOC-Lab-Cheatsheet.docx
@@ -15,7 +15,7 @@
         <w:rPr>
           <w:i/>
         </w:rPr>
-        <w:t>Two halves: the checklist (what to do, in order) and the lookup (what's the command/IP/path again). Ctrl+F is your friend.</w:t>
+        <w:t>Two halves: the checklist (what to do, in order) and the lookup (what's the command/IP/path again). Ctrl+F is my friend.</w:t>
       </w:r>
     </w:p>
     <w:p>
@@ -31,7 +31,7 @@
         <w:pStyle w:val="Heading2"/>
       </w:pPr>
       <w:r>
-        <w:t>Before you start ANY session</w:t>
+        <w:t>Before I start ANY session</w:t>
       </w:r>
     </w:p>
     <w:p>
@@ -39,7 +39,7 @@
         <w:pStyle w:val="ListBullet"/>
       </w:pPr>
       <w:r>
-        <w:t>☐ Turn on session recording, pick the one that matches where you're working (see Part 2 → Session recording).</w:t>
+        <w:t>☐ Turn on session recording, pick the one that matches where I'm working (see Part 2 → Session recording).</w:t>
       </w:r>
     </w:p>
     <w:p>
@@ -62,10 +62,10 @@
         <w:rPr>
           <w:rFonts w:ascii="Consolas" w:hAnsi="Consolas"/>
         </w:rPr>
-        <w:t>logs/</w:t>
+        <w:t>Build Logs/</w:t>
       </w:r>
       <w:r>
-        <w:t>), you're logging as you go, not reconstructing later.</w:t>
+        <w:t>), I'm logging as I go, not reconstructing later.</w:t>
       </w:r>
     </w:p>
     <w:p>
@@ -73,7 +73,7 @@
         <w:pStyle w:val="ListBullet"/>
       </w:pPr>
       <w:r>
-        <w:t>☐ Know your recovery path before you need it, see the Recovery Ladder below. Confirm it works, don't assume.</w:t>
+        <w:t>☐ Know my recovery path before I need it, see the Recovery Ladder below. Confirm it works, don't assume.</w:t>
       </w:r>
     </w:p>
     <w:p>
@@ -89,7 +89,7 @@
         <w:pStyle w:val="Heading2"/>
       </w:pPr>
       <w:r>
-        <w:t>Risk tiers, how much prep before you touch it</w:t>
+        <w:t>Risk tiers, how much prep before I touch it</w:t>
       </w:r>
     </w:p>
     <w:tbl>
@@ -255,7 +255,7 @@
         <w:rPr>
           <w:i/>
         </w:rPr>
-        <w:t>*Everything network-related is HIGH. No exceptions. That's the category that cost you a full Proxmox reinstall.*</w:t>
+        <w:t>*Everything network-related is HIGH. No exceptions. That's the category that cost me a full Proxmox reinstall.*</w:t>
       </w:r>
     </w:p>
     <w:p>
@@ -271,7 +271,7 @@
         <w:pStyle w:val="ListBullet"/>
       </w:pPr>
       <w:r>
-        <w:t>☐ Understand before running. If Claude Code proposes something you don't follow, ask.</w:t>
+        <w:t>☐ Understand before running. If Claude Code proposes something I don't follow, ask.</w:t>
       </w:r>
     </w:p>
     <w:p>
@@ -328,7 +328,7 @@
         <w:pStyle w:val="ListBullet"/>
       </w:pPr>
       <w:r>
-        <w:t>☐ Explain it back. Can you say what you built and why, out loud?</w:t>
+        <w:t>☐ Explain it back. Can I say what I built and why, out loud?</w:t>
       </w:r>
     </w:p>
     <w:p>
@@ -350,7 +350,7 @@
         <w:rPr>
           <w:rFonts w:ascii="Consolas" w:hAnsi="Consolas"/>
         </w:rPr>
-        <w:t>logs/</w:t>
+        <w:t>Build Logs/</w:t>
       </w:r>
       <w:r>
         <w:t xml:space="preserve"> with the phase outcome and any rollback point created.</w:t>
@@ -377,7 +377,7 @@
         <w:rPr>
           <w:i/>
         </w:rPr>
-        <w:t>Work down the list until something works. Know this cold before you need it.</w:t>
+        <w:t>Work down the list until something works. Know this cold before I need it.</w:t>
       </w:r>
     </w:p>
     <w:tbl>
@@ -400,7 +400,7 @@
               <w:rPr>
                 <w:b/>
               </w:rPr>
-              <w:t>If you lose…</w:t>
+              <w:t>If I lose…</w:t>
             </w:r>
           </w:p>
         </w:tc>
@@ -609,7 +609,7 @@
         <w:rPr>
           <w:i/>
         </w:rPr>
-        <w:t>*The rule this table encodes: never make a change that could cut off your only access path.*</w:t>
+        <w:t>*The rule this table encodes: never make a change that could cut off my only access path.*</w:t>
       </w:r>
     </w:p>
     <w:p>
@@ -1205,7 +1205,7 @@
         <w:rPr>
           <w:i/>
         </w:rPr>
-        <w:t>*You run the command. You paste the output into chat. Claude reads it, tells you if it worked and why, and gives you the next step.*</w:t>
+        <w:t>*I run the command. I paste the output into chat. Claude reads it, tells me if it worked and why, and gives me the next step.*</w:t>
       </w:r>
     </w:p>
     <w:p>
@@ -1213,7 +1213,7 @@
         <w:pStyle w:val="ListBullet"/>
       </w:pPr>
       <w:r>
-        <w:t>Claude CANNOT see your terminal. What you paste is all it gets.</w:t>
+        <w:t>Claude CANNOT see my terminal. What I paste is all it gets.</w:t>
       </w:r>
     </w:p>
     <w:p>
@@ -1237,7 +1237,7 @@
         <w:pStyle w:val="ListBullet"/>
       </w:pPr>
       <w:r>
-        <w:t xml:space="preserve">Project instructions carry your hardware, IPs and gotchas into every new chat, paste </w:t>
+        <w:t xml:space="preserve">Project instructions carry my hardware, IPs and gotchas into every new chat, paste </w:t>
       </w:r>
       <w:r>
         <w:rPr>
@@ -1254,7 +1254,7 @@
         <w:pStyle w:val="ListBullet"/>
       </w:pPr>
       <w:r>
-        <w:t>Core security logic (firewall rules, detection rules, Shuffle playbooks, n8n routing thresholds), Claude explains and drafts, YOU write the final.</w:t>
+        <w:t>Core security logic (firewall rules, detection rules, Shuffle playbooks, n8n routing thresholds), Claude explains and drafts, I write the final.</w:t>
       </w:r>
     </w:p>
     <w:p>
@@ -1281,7 +1281,7 @@
         <w:rPr>
           <w:rFonts w:ascii="Consolas" w:hAnsi="Consolas"/>
         </w:rPr>
-        <w:t>C:\Users\micha\SOC-Lab 7-15-2026\Build-Transcripts 7-16-2026\Logs\switch-&amp;Y&amp;M&amp;D-&amp;T.log</w:t>
+        <w:t>C:\Users\micha\SOC-Lab 7-15-2026\Build-Transcripts 7-16-2026\Session Logging\switch-&amp;Y&amp;M&amp;D-&amp;T.log</w:t>
       </w:r>
       <w:r/>
     </w:p>
@@ -1302,7 +1302,7 @@
           <w:rFonts w:ascii="Consolas" w:hAnsi="Consolas"/>
           <w:sz w:val="19"/>
         </w:rPr>
-        <w:t>Start-Transcript -Path "C:\Users\micha\SOC-Lab 7-15-2026\Build-Transcripts 7-16-2026\Logs\session-$(Get-Date -Format 'yyyy-MM-dd-HHmm').txt"</w:t>
+        <w:t>Start-Transcript -Path "C:\Users\micha\SOC-Lab 7-15-2026\Build-Transcripts 7-16-2026\Session Logging\session-$(Get-Date -Format 'yyyy-MM-dd-HHmm').txt"</w:t>
         <w:br/>
         <w:t># ...work...</w:t>
         <w:br/>
@@ -1338,7 +1338,7 @@
         <w:pStyle w:val="Heading2"/>
       </w:pPr>
       <w:r>
-        <w:t>Proxmox, network commands (the ones that saved you)</w:t>
+        <w:t>Proxmox, network commands (the ones that saved me)</w:t>
       </w:r>
     </w:p>
     <w:p>
@@ -1378,7 +1378,7 @@
         <w:pStyle w:val="Heading3"/>
       </w:pPr>
       <w:r>
-        <w:t>The bridge/network gotchas you already hit</w:t>
+        <w:t>The bridge/network gotchas I already hit</w:t>
       </w:r>
     </w:p>
     <w:p>
@@ -1668,7 +1668,7 @@
         <w:rPr>
           <w:i/>
         </w:rPr>
-        <w:t>Note: `docker compose` (v2, space) vs `docker-compose` (v1, hyphen), check which your install uses.</w:t>
+        <w:t>Note: `docker compose` (v2, space) vs `docker-compose` (v1, hyphen), check which my install uses.</w:t>
       </w:r>
     </w:p>
     <w:p>
@@ -1768,7 +1768,7 @@
         <w:t>WATCH THIS:</w:t>
       </w:r>
       <w:r>
-        <w:t xml:space="preserve"> Headless Claude Code draws from your subscription's usage limits, same pool as interactive use. </w:t>
+        <w:t xml:space="preserve"> Headless Claude Code draws from my subscription's usage limits, same pool as interactive use. </w:t>
       </w:r>
       <w:r>
         <w:rPr>
@@ -1777,7 +1777,7 @@
         <w:t>--max-turns</w:t>
       </w:r>
       <w:r>
-        <w:t xml:space="preserve"> is a safety guardrail so a background loop doesn't burn your daily quota in one go.</w:t>
+        <w:t xml:space="preserve"> is a safety guardrail so a background loop doesn't burn my daily quota in one go.</w:t>
       </w:r>
     </w:p>
     <w:p>
@@ -2002,9 +2002,9 @@
         <w:br/>
         <w:t>├── SOC-Lab-Cheatsheet.md        &lt;- this file</w:t>
         <w:br/>
-        <w:t>├── build_log.md                 &lt;- short index into logs/, created Phase 1, maintained throughout</w:t>
+        <w:t>├── build_log.md                 &lt;- short index into Build Logs/, created Phase 1, maintained throughout</w:t>
         <w:br/>
-        <w:t>├── logs\                        &lt;- the actual build narrative, one numbered folder per phase (01 through 12)</w:t>
+        <w:t>├── Build Logs\                  &lt;- the actual build narrative, one numbered folder per phase (01 through 12)</w:t>
         <w:br/>
         <w:t>│   ├── Phase 01 Network Rebuild\</w:t>
         <w:br/>
@@ -2032,9 +2032,9 @@
         <w:br/>
         <w:t>├── agent-registry.md            &lt;- created Phase 9, wazuh-triage-01 + triage-router-01</w:t>
         <w:br/>
-        <w:t>├── investigations\               &lt;- your writeups = the portfolio</w:t>
+        <w:t>├── investigations\               &lt;- my writeups = the portfolio</w:t>
         <w:br/>
-        <w:t>└── Logs\                        &lt;- session transcripts, lives IN this repo folder now but excluded via .gitignore, never pushed to GitHub</w:t>
+        <w:t>└── Session Logging\              &lt;- raw session transcripts (PowerShell `Start-Transcript`, PuTTY switch logs) and pfSense config exports, lives IN this repo folder, declared in .gitignore as local-only</w:t>
       </w:r>
     </w:p>
     <w:p>
@@ -2058,7 +2058,7 @@
         <w:rPr>
           <w:i/>
         </w:rPr>
-        <w:t>*Log it, snapshot it, confirm your fallback, change one thing, verify it, explain it back.*</w:t>
+        <w:t>*Log it, snapshot it, confirm my fallback, change one thing, verify it, explain it back.*</w:t>
       </w:r>
     </w:p>
     <w:sectPr>

</xml_diff>